<commit_message>
fix(JBI): Statement of Significance per Guide for Authors (avoid desk reject)
Editor/Guide requires the Statement of Significance as a table (<=150 words)
embedded at the END OF THE INTRODUCTION, with FOUR fields. The prior version
was a separate file, 3 fields, and over length. Now:
- Embedded as a table at the end of 01_introduction_v5.md (appears before
  Methods in the rebuilt manuscript docx).
- Four required fields: Problem or Issue / What is Already Known /
  What This Paper Adds / Who Would Benefit.
- 123 words (<= 150).
- Standalone Statement_of_Significance_JBI.docx updated to match.
- Manuscript docx rebuilt (0 unresolved citations).

Co-Authored-By: Claude Opus 4.8 <noreply@anthropic.com>
</commit_message>
<xml_diff>
--- a/manuscript/Statement_of_Significance_JBI.docx
+++ b/manuscript/Statement_of_Significance_JBI.docx
@@ -29,6 +29,18 @@
         <w:t xml:space="preserve">A reusable cell-composition-adjusted re-analysis pipeline for interpreting bulk-tissue null results in low-abundance lncRNA studies: IDI2-AS1 / IL5 as a worked example across type-2 allergic diseases</w:t>
       </w:r>
     </w:p>
+    <w:p>
+      <w:pPr>
+        <w:pStyle w:val="BodyText"/>
+      </w:pPr>
+      <w:r>
+        <w:rPr>
+          <w:i/>
+          <w:iCs/>
+        </w:rPr>
+        <w:t xml:space="preserve">(This Statement of Significance is also embedded at the end of the Introduction in the main manuscript, per the Guide for Authors. Statement content: 123 words.)</w:t>
+      </w:r>
+    </w:p>
     <w:tbl>
       <w:tblPr>
         <w:tblStyle w:val="Table"/>
@@ -52,7 +64,7 @@
                 <w:b/>
                 <w:bCs/>
               </w:rPr>
-              <w:t xml:space="preserve">Problem</w:t>
+              <w:t xml:space="preserve">Problem or Issue</w:t>
             </w:r>
           </w:p>
         </w:tc>
@@ -63,7 +75,7 @@
               <w:pStyle w:val="Compact"/>
             </w:pPr>
             <w:r>
-              <w:t xml:space="preserve">A large fraction of biomedical-informatics work re-uses public bulk RNA-seq that was not designed for the question being asked. For low-abundance, cell-type-restricted features such as long noncoding RNAs (lncRNAs), the standard operations — a case-vs-control differential-expression catalog and a sample-level correlation with a putative target — conflate two biologically distinct quantities: the per-cell expression of the feature inside its effector subset, and the abundance of that subset within the sample. When these move in opposite directions in disease, the bulk readout is masked, inverted, or read as null, and a real per-cell effect can be wrongly dismissed. No standardized, reusable workflow isolates these contributions from bulk data alone.</w:t>
+              <w:t xml:space="preserve">Re-using public bulk RNA-seq to evaluate low-abundance, cell-type-restricted long noncoding RNAs is error-prone: bulk readouts conflate per-cell regulation with cell-composition shifts, so a null or sign-inverted result can be mis-read as evidence against in vivo function.</w:t>
             </w:r>
           </w:p>
         </w:tc>
@@ -91,7 +103,7 @@
               <w:pStyle w:val="Compact"/>
             </w:pPr>
             <w:r>
-              <w:t xml:space="preserve">The individual statistical components are established — differential expression (DESeq2/limma), random-effects meta-analysis, marker- and ssGSEA-based deconvolution, partial correlation, and effect decomposition. However, they are applied ad hoc, with no defined, reproducible discipline for distinguishing compositional masking from a genuine absence of regulation in cell-type-restricted lncRNA candidates. The practical failure modes of applying off-the-shelf deconvolution to rare, spillover-prone cell types in bulk re-analysis are also under-appreciated.</w:t>
+              <w:t xml:space="preserve">The component methods—differential expression, meta-analysis, deconvolution, partial correlation, effect decomposition—are established but applied ad hoc; no standardized, reusable workflow distinguishes compositional masking from a genuine absence of regulation.</w:t>
             </w:r>
           </w:p>
         </w:tc>
@@ -119,7 +131,51 @@
               <w:pStyle w:val="Compact"/>
             </w:pPr>
             <w:r>
-              <w:t xml:space="preserve">A reusable, openly released re-analysis pipeline that statistically partitions a bulk feature–target association into composition-attributable and residual components, with a built-in cross-method robustness check (a transparent marker signature versus independent xCell deconvolution) and an unmeasured-confounding sensitivity analysis. As a worked example on IDI2-AS1 / IL5 across five public cohorts (n = 856), it attributes the majority of the bulk IDI2-AS1–IL5 covariation in the only adequately powered cohort (asthma, n = 695) to shared eosinophil abundance — ≈ 90 % under the marker signature and ≈ 70 % under independent deconvolution — reframing a bulk null as a compositional-masking hypothesis to be tested at single-cell resolution rather than as evidence against in vivo relevance. It additionally documents a concrete, generalizable pitfall: default spillover compensation floors rare cell-type estimates in epithelial samples and would otherwise produce a spuriously null adjustment. The framework is portable to any low-abundance, cell-type-restricted candidate re-evaluated against public bulk transcriptomes.</w:t>
+              <w:t xml:space="preserve">An openly released pipeline that statistically partitions a bulk feature–target association into composition-attributable and residual components, with a cross-method robustness check and a confounding-sensitivity analysis; demonstrated on IDI2-AS1/IL5 (asthma,</w:t>
+            </w:r>
+            <w:r>
+              <w:t xml:space="preserve"> </w:t>
+            </w:r>
+            <w:r>
+              <w:rPr>
+                <w:i/>
+                <w:iCs/>
+              </w:rPr>
+              <w:t xml:space="preserve">n</w:t>
+            </w:r>
+            <w:r>
+              <w:t xml:space="preserve"> </w:t>
+            </w:r>
+            <w:r>
+              <w:t xml:space="preserve">= 695: ~70–90% eosinophil-attributable).</w:t>
+            </w:r>
+          </w:p>
+        </w:tc>
+      </w:tr>
+      <w:tr>
+        <w:tc>
+          <w:tcPr/>
+          <w:p>
+            <w:pPr>
+              <w:pStyle w:val="Compact"/>
+            </w:pPr>
+            <w:r>
+              <w:rPr>
+                <w:b/>
+                <w:bCs/>
+              </w:rPr>
+              <w:t xml:space="preserve">Who Would Benefit</w:t>
+            </w:r>
+          </w:p>
+        </w:tc>
+        <w:tc>
+          <w:tcPr/>
+          <w:p>
+            <w:pPr>
+              <w:pStyle w:val="Compact"/>
+            </w:pPr>
+            <w:r>
+              <w:t xml:space="preserve">Biomedical-informatics researchers and computational biologists re-analyzing public bulk transcriptomes for cell-type-restricted regulators, who must avoid mis-reading bulk nulls as biological absence.</w:t>
             </w:r>
           </w:p>
         </w:tc>

</xml_diff>